<commit_message>
docs: remove redundant readme and update final documentation
</commit_message>
<xml_diff>
--- a/README_Documentation.docx
+++ b/README_Documentation.docx
@@ -19,16 +19,6 @@
     </w:p>
     <w:p>
       <w:r>
-        <w:rPr>
-          <w:b/>
-          <w:bCs/>
-        </w:rPr>
-        <w:t>Candidate:</w:t>
-      </w:r>
-      <w:r>
-        <w:t xml:space="preserve"> [Your Name]</w:t>
-      </w:r>
-      <w:r>
         <w:br/>
       </w:r>
       <w:r>
@@ -207,23 +197,7 @@
           <w:b/>
           <w:bCs/>
         </w:rPr>
-        <w:t>CTEs with ROW_</w:t>
-      </w:r>
-      <w:proofErr w:type="gramStart"/>
-      <w:r>
-        <w:rPr>
-          <w:b/>
-          <w:bCs/>
-        </w:rPr>
-        <w:t>NUMBER(</w:t>
-      </w:r>
-      <w:proofErr w:type="gramEnd"/>
-      <w:r>
-        <w:rPr>
-          <w:b/>
-          <w:bCs/>
-        </w:rPr>
-        <w:t>)</w:t>
+        <w:t>CTEs with ROW_NUMBER()</w:t>
       </w:r>
       <w:r>
         <w:t xml:space="preserve"> to de-duplicate these at the point of ingestion.</w:t>
@@ -466,13 +440,8 @@
         <w:t xml:space="preserve"> (</w:t>
       </w:r>
       <w:proofErr w:type="spellStart"/>
-      <w:proofErr w:type="gramStart"/>
-      <w:r>
-        <w:t>gold.vw</w:t>
-      </w:r>
-      <w:proofErr w:type="gramEnd"/>
-      <w:r>
-        <w:t>_ApplicantAdmissionSummary</w:t>
+      <w:r>
+        <w:t>gold.vw_ApplicantAdmissionSummary</w:t>
       </w:r>
       <w:proofErr w:type="spellEnd"/>
       <w:r>
@@ -2708,6 +2677,7 @@
   <w:style w:type="character" w:default="1" w:styleId="DefaultParagraphFont">
     <w:name w:val="Default Paragraph Font"/>
     <w:uiPriority w:val="1"/>
+    <w:semiHidden/>
     <w:unhideWhenUsed/>
   </w:style>
   <w:style w:type="table" w:default="1" w:styleId="TableNormal">

</xml_diff>